<commit_message>
Remove superseded files: 15 October QA report and unused engagement page images
The QA report's findings are superseded by the current build; references to it are removed from the
documentation index, technical documentation and governance guide (Word copies regenerated).

Co-Authored-By: Claude Opus 5.5 <noreply@anthropic.com>
Claude-Session: https://claude.ai/code/session_01BCzcS7kB9PYn4XhtsXF9GJ
</commit_message>
<xml_diff>
--- a/docs/manuals/00-Documentation-Index.docx
+++ b/docs/manuals/00-Documentation-Index.docx
@@ -173,21 +173,22 @@
         <w:p>
           <w:r>
             <w:fldChar w:fldCharType="begin" w:dirty="true"/>
-            <w:instrText xml:space="preserve">TOC \o "1-2" \h \z \u</w:instrText>
+            <w:instrText xml:space="preserve">TOC \o "1-3" \h \z \u</w:instrText>
             <w:fldChar w:fldCharType="separate"/>
             <w:fldChar w:fldCharType="end"/>
           </w:r>
         </w:p>
       </w:sdtContent>
     </w:sdt>
-    <w:bookmarkStart w:id="20" w:name="purpose"/>
     <w:p>
       <w:pPr>
         <w:pStyle w:val="Heading1"/>
       </w:pPr>
+      <w:bookmarkStart w:id="20" w:name="purpose"/>
       <w:r>
         <w:t xml:space="preserve">1. Purpose</w:t>
       </w:r>
+      <w:bookmarkEnd w:id="20"/>
     </w:p>
     <w:p>
       <w:pPr>
@@ -197,15 +198,15 @@
         <w:t xml:space="preserve">This index lists every document needed to build, run, govern, use and train people on the GPHA Internal Audit Workspace (GIAW). It shows the purpose, audience, format and status of each, plus the further documents GPHA still has to produce or approve.</w:t>
       </w:r>
     </w:p>
-    <w:bookmarkEnd w:id="20"/>
-    <w:bookmarkStart w:id="21" w:name="the-documentation-set-delivered"/>
     <w:p>
       <w:pPr>
         <w:pStyle w:val="Heading1"/>
       </w:pPr>
+      <w:bookmarkStart w:id="21" w:name="the-documentation-set-delivered"/>
       <w:r>
         <w:t xml:space="preserve">2. The documentation set (delivered)</w:t>
       </w:r>
+      <w:bookmarkEnd w:id="21"/>
     </w:p>
     <w:p>
       <w:pPr>
@@ -251,9 +252,8 @@
     <w:tbl>
       <w:tblPr>
         <w:tblStyle w:val="Table"/>
-        <w:tblW w:type="pct" w:w="5000"/>
-        <w:tblLook w:firstRow="1" w:lastRow="0" w:firstColumn="0" w:lastColumn="0" w:noHBand="0" w:noVBand="0" w:val="0020"/>
-        <w:jc w:val="start"/>
+        <w:tblW w:type="pct" w:w="5000.0"/>
+        <w:tblLook w:firstRow="1"/>
       </w:tblPr>
       <w:tblGrid>
         <w:gridCol w:w="410"/>
@@ -265,12 +265,14 @@
       </w:tblGrid>
       <w:tr>
         <w:trPr>
-          <w:tblHeader w:val="true"/>
-          <w:tblHeader w:val="true"/>
+          <w:cnfStyle w:firstRow="1"/>
         </w:trPr>
         <w:tc>
           <w:tcPr>
-            <w:shd w:val="clear" w:color="auto" w:fill="1E60AE"/>
+            <w:tcBorders>
+              <w:bottom w:val="single"/>
+            </w:tcBorders>
+            <w:vAlign w:val="bottom"/>
           </w:tcPr>
           <w:p>
             <w:pPr>
@@ -278,17 +280,16 @@
               <w:jc w:val="left"/>
             </w:pPr>
             <w:r>
-              <w:rPr>
-                <w:b/>
-                <w:color w:val="FFFFFF"/>
-              </w:rPr>
               <w:t xml:space="preserve">No.</w:t>
             </w:r>
           </w:p>
         </w:tc>
         <w:tc>
           <w:tcPr>
-            <w:shd w:val="clear" w:color="auto" w:fill="1E60AE"/>
+            <w:tcBorders>
+              <w:bottom w:val="single"/>
+            </w:tcBorders>
+            <w:vAlign w:val="bottom"/>
           </w:tcPr>
           <w:p>
             <w:pPr>
@@ -296,17 +297,16 @@
               <w:jc w:val="left"/>
             </w:pPr>
             <w:r>
-              <w:rPr>
-                <w:b/>
-                <w:color w:val="FFFFFF"/>
-              </w:rPr>
               <w:t xml:space="preserve">Document</w:t>
             </w:r>
           </w:p>
         </w:tc>
         <w:tc>
           <w:tcPr>
-            <w:shd w:val="clear" w:color="auto" w:fill="1E60AE"/>
+            <w:tcBorders>
+              <w:bottom w:val="single"/>
+            </w:tcBorders>
+            <w:vAlign w:val="bottom"/>
           </w:tcPr>
           <w:p>
             <w:pPr>
@@ -314,17 +314,16 @@
               <w:jc w:val="left"/>
             </w:pPr>
             <w:r>
-              <w:rPr>
-                <w:b/>
-                <w:color w:val="FFFFFF"/>
-              </w:rPr>
               <w:t xml:space="preserve">Purpose</w:t>
             </w:r>
           </w:p>
         </w:tc>
         <w:tc>
           <w:tcPr>
-            <w:shd w:val="clear" w:color="auto" w:fill="1E60AE"/>
+            <w:tcBorders>
+              <w:bottom w:val="single"/>
+            </w:tcBorders>
+            <w:vAlign w:val="bottom"/>
           </w:tcPr>
           <w:p>
             <w:pPr>
@@ -332,17 +331,16 @@
               <w:jc w:val="left"/>
             </w:pPr>
             <w:r>
-              <w:rPr>
-                <w:b/>
-                <w:color w:val="FFFFFF"/>
-              </w:rPr>
               <w:t xml:space="preserve">Main audience</w:t>
             </w:r>
           </w:p>
         </w:tc>
         <w:tc>
           <w:tcPr>
-            <w:shd w:val="clear" w:color="auto" w:fill="1E60AE"/>
+            <w:tcBorders>
+              <w:bottom w:val="single"/>
+            </w:tcBorders>
+            <w:vAlign w:val="bottom"/>
           </w:tcPr>
           <w:p>
             <w:pPr>
@@ -350,17 +348,16 @@
               <w:jc w:val="left"/>
             </w:pPr>
             <w:r>
-              <w:rPr>
-                <w:b/>
-                <w:color w:val="FFFFFF"/>
-              </w:rPr>
               <w:t xml:space="preserve">Files</w:t>
             </w:r>
           </w:p>
         </w:tc>
         <w:tc>
           <w:tcPr>
-            <w:shd w:val="clear" w:color="auto" w:fill="1E60AE"/>
+            <w:tcBorders>
+              <w:bottom w:val="single"/>
+            </w:tcBorders>
+            <w:vAlign w:val="bottom"/>
           </w:tcPr>
           <w:p>
             <w:pPr>
@@ -368,10 +365,6 @@
               <w:jc w:val="left"/>
             </w:pPr>
             <w:r>
-              <w:rPr>
-                <w:b/>
-                <w:color w:val="FFFFFF"/>
-              </w:rPr>
               <w:t xml:space="preserve">Status</w:t>
             </w:r>
           </w:p>
@@ -379,7 +372,6 @@
       </w:tr>
       <w:tr>
         <w:tc>
-          <w:tcPr/>
           <w:p>
             <w:pPr>
               <w:pStyle w:val="Compact"/>
@@ -391,7 +383,6 @@
           </w:p>
         </w:tc>
         <w:tc>
-          <w:tcPr/>
           <w:p>
             <w:pPr>
               <w:pStyle w:val="Compact"/>
@@ -403,7 +394,6 @@
           </w:p>
         </w:tc>
         <w:tc>
-          <w:tcPr/>
           <w:p>
             <w:pPr>
               <w:pStyle w:val="Compact"/>
@@ -415,7 +405,6 @@
           </w:p>
         </w:tc>
         <w:tc>
-          <w:tcPr/>
           <w:p>
             <w:pPr>
               <w:pStyle w:val="Compact"/>
@@ -427,7 +416,6 @@
           </w:p>
         </w:tc>
         <w:tc>
-          <w:tcPr/>
           <w:p>
             <w:pPr>
               <w:pStyle w:val="Compact"/>
@@ -457,7 +445,6 @@
           </w:p>
         </w:tc>
         <w:tc>
-          <w:tcPr/>
           <w:p>
             <w:pPr>
               <w:pStyle w:val="Compact"/>
@@ -471,7 +458,6 @@
       </w:tr>
       <w:tr>
         <w:tc>
-          <w:tcPr/>
           <w:p>
             <w:pPr>
               <w:pStyle w:val="Compact"/>
@@ -483,7 +469,6 @@
           </w:p>
         </w:tc>
         <w:tc>
-          <w:tcPr/>
           <w:p>
             <w:pPr>
               <w:pStyle w:val="Compact"/>
@@ -495,7 +480,6 @@
           </w:p>
         </w:tc>
         <w:tc>
-          <w:tcPr/>
           <w:p>
             <w:pPr>
               <w:pStyle w:val="Compact"/>
@@ -507,7 +491,6 @@
           </w:p>
         </w:tc>
         <w:tc>
-          <w:tcPr/>
           <w:p>
             <w:pPr>
               <w:pStyle w:val="Compact"/>
@@ -519,7 +502,6 @@
           </w:p>
         </w:tc>
         <w:tc>
-          <w:tcPr/>
           <w:p>
             <w:pPr>
               <w:pStyle w:val="Compact"/>
@@ -549,7 +531,6 @@
           </w:p>
         </w:tc>
         <w:tc>
-          <w:tcPr/>
           <w:p>
             <w:pPr>
               <w:pStyle w:val="Compact"/>
@@ -563,7 +544,6 @@
       </w:tr>
       <w:tr>
         <w:tc>
-          <w:tcPr/>
           <w:p>
             <w:pPr>
               <w:pStyle w:val="Compact"/>
@@ -575,7 +555,6 @@
           </w:p>
         </w:tc>
         <w:tc>
-          <w:tcPr/>
           <w:p>
             <w:pPr>
               <w:pStyle w:val="Compact"/>
@@ -587,7 +566,6 @@
           </w:p>
         </w:tc>
         <w:tc>
-          <w:tcPr/>
           <w:p>
             <w:pPr>
               <w:pStyle w:val="Compact"/>
@@ -599,7 +577,6 @@
           </w:p>
         </w:tc>
         <w:tc>
-          <w:tcPr/>
           <w:p>
             <w:pPr>
               <w:pStyle w:val="Compact"/>
@@ -611,7 +588,6 @@
           </w:p>
         </w:tc>
         <w:tc>
-          <w:tcPr/>
           <w:p>
             <w:pPr>
               <w:pStyle w:val="Compact"/>
@@ -641,7 +617,6 @@
           </w:p>
         </w:tc>
         <w:tc>
-          <w:tcPr/>
           <w:p>
             <w:pPr>
               <w:pStyle w:val="Compact"/>
@@ -655,7 +630,6 @@
       </w:tr>
       <w:tr>
         <w:tc>
-          <w:tcPr/>
           <w:p>
             <w:pPr>
               <w:pStyle w:val="Compact"/>
@@ -667,7 +641,6 @@
           </w:p>
         </w:tc>
         <w:tc>
-          <w:tcPr/>
           <w:p>
             <w:pPr>
               <w:pStyle w:val="Compact"/>
@@ -679,7 +652,6 @@
           </w:p>
         </w:tc>
         <w:tc>
-          <w:tcPr/>
           <w:p>
             <w:pPr>
               <w:pStyle w:val="Compact"/>
@@ -706,7 +678,6 @@
           </w:p>
         </w:tc>
         <w:tc>
-          <w:tcPr/>
           <w:p>
             <w:pPr>
               <w:pStyle w:val="Compact"/>
@@ -718,7 +689,6 @@
           </w:p>
         </w:tc>
         <w:tc>
-          <w:tcPr/>
           <w:p>
             <w:pPr>
               <w:pStyle w:val="Compact"/>
@@ -748,7 +718,6 @@
           </w:p>
         </w:tc>
         <w:tc>
-          <w:tcPr/>
           <w:p>
             <w:pPr>
               <w:pStyle w:val="Compact"/>
@@ -762,7 +731,6 @@
       </w:tr>
       <w:tr>
         <w:tc>
-          <w:tcPr/>
           <w:p>
             <w:pPr>
               <w:pStyle w:val="Compact"/>
@@ -774,7 +742,6 @@
           </w:p>
         </w:tc>
         <w:tc>
-          <w:tcPr/>
           <w:p>
             <w:pPr>
               <w:pStyle w:val="Compact"/>
@@ -786,7 +753,6 @@
           </w:p>
         </w:tc>
         <w:tc>
-          <w:tcPr/>
           <w:p>
             <w:pPr>
               <w:pStyle w:val="Compact"/>
@@ -798,7 +764,6 @@
           </w:p>
         </w:tc>
         <w:tc>
-          <w:tcPr/>
           <w:p>
             <w:pPr>
               <w:pStyle w:val="Compact"/>
@@ -810,7 +775,6 @@
           </w:p>
         </w:tc>
         <w:tc>
-          <w:tcPr/>
           <w:p>
             <w:pPr>
               <w:pStyle w:val="Compact"/>
@@ -840,7 +804,6 @@
           </w:p>
         </w:tc>
         <w:tc>
-          <w:tcPr/>
           <w:p>
             <w:pPr>
               <w:pStyle w:val="Compact"/>
@@ -854,7 +817,6 @@
       </w:tr>
       <w:tr>
         <w:tc>
-          <w:tcPr/>
           <w:p>
             <w:pPr>
               <w:pStyle w:val="Compact"/>
@@ -866,7 +828,6 @@
           </w:p>
         </w:tc>
         <w:tc>
-          <w:tcPr/>
           <w:p>
             <w:pPr>
               <w:pStyle w:val="Compact"/>
@@ -878,7 +839,6 @@
           </w:p>
         </w:tc>
         <w:tc>
-          <w:tcPr/>
           <w:p>
             <w:pPr>
               <w:pStyle w:val="Compact"/>
@@ -890,7 +850,6 @@
           </w:p>
         </w:tc>
         <w:tc>
-          <w:tcPr/>
           <w:p>
             <w:pPr>
               <w:pStyle w:val="Compact"/>
@@ -902,7 +861,6 @@
           </w:p>
         </w:tc>
         <w:tc>
-          <w:tcPr/>
           <w:p>
             <w:pPr>
               <w:pStyle w:val="Compact"/>
@@ -932,7 +890,6 @@
           </w:p>
         </w:tc>
         <w:tc>
-          <w:tcPr/>
           <w:p>
             <w:pPr>
               <w:pStyle w:val="Compact"/>
@@ -946,7 +903,6 @@
       </w:tr>
       <w:tr>
         <w:tc>
-          <w:tcPr/>
           <w:p>
             <w:pPr>
               <w:pStyle w:val="Compact"/>
@@ -958,7 +914,6 @@
           </w:p>
         </w:tc>
         <w:tc>
-          <w:tcPr/>
           <w:p>
             <w:pPr>
               <w:pStyle w:val="Compact"/>
@@ -970,7 +925,6 @@
           </w:p>
         </w:tc>
         <w:tc>
-          <w:tcPr/>
           <w:p>
             <w:pPr>
               <w:pStyle w:val="Compact"/>
@@ -982,7 +936,6 @@
           </w:p>
         </w:tc>
         <w:tc>
-          <w:tcPr/>
           <w:p>
             <w:pPr>
               <w:pStyle w:val="Compact"/>
@@ -994,7 +947,6 @@
           </w:p>
         </w:tc>
         <w:tc>
-          <w:tcPr/>
           <w:p>
             <w:pPr>
               <w:pStyle w:val="Compact"/>
@@ -1024,7 +976,6 @@
           </w:p>
         </w:tc>
         <w:tc>
-          <w:tcPr/>
           <w:p>
             <w:pPr>
               <w:pStyle w:val="Compact"/>
@@ -1038,7 +989,6 @@
       </w:tr>
       <w:tr>
         <w:tc>
-          <w:tcPr/>
           <w:p>
             <w:pPr>
               <w:pStyle w:val="Compact"/>
@@ -1050,7 +1000,6 @@
           </w:p>
         </w:tc>
         <w:tc>
-          <w:tcPr/>
           <w:p>
             <w:pPr>
               <w:pStyle w:val="Compact"/>
@@ -1062,7 +1011,6 @@
           </w:p>
         </w:tc>
         <w:tc>
-          <w:tcPr/>
           <w:p>
             <w:pPr>
               <w:pStyle w:val="Compact"/>
@@ -1074,7 +1022,6 @@
           </w:p>
         </w:tc>
         <w:tc>
-          <w:tcPr/>
           <w:p>
             <w:pPr>
               <w:pStyle w:val="Compact"/>
@@ -1086,7 +1033,6 @@
           </w:p>
         </w:tc>
         <w:tc>
-          <w:tcPr/>
           <w:p>
             <w:pPr>
               <w:pStyle w:val="Compact"/>
@@ -1101,7 +1047,6 @@
           </w:p>
         </w:tc>
         <w:tc>
-          <w:tcPr/>
           <w:p>
             <w:pPr>
               <w:pStyle w:val="Compact"/>
@@ -1115,7 +1060,6 @@
       </w:tr>
       <w:tr>
         <w:tc>
-          <w:tcPr/>
           <w:p>
             <w:pPr>
               <w:pStyle w:val="Compact"/>
@@ -1127,7 +1071,6 @@
           </w:p>
         </w:tc>
         <w:tc>
-          <w:tcPr/>
           <w:p>
             <w:pPr>
               <w:pStyle w:val="Compact"/>
@@ -1139,7 +1082,6 @@
           </w:p>
         </w:tc>
         <w:tc>
-          <w:tcPr/>
           <w:p>
             <w:pPr>
               <w:pStyle w:val="Compact"/>
@@ -1151,7 +1093,6 @@
           </w:p>
         </w:tc>
         <w:tc>
-          <w:tcPr/>
           <w:p>
             <w:pPr>
               <w:pStyle w:val="Compact"/>
@@ -1163,7 +1104,6 @@
           </w:p>
         </w:tc>
         <w:tc>
-          <w:tcPr/>
           <w:p>
             <w:pPr>
               <w:pStyle w:val="Compact"/>
@@ -1178,7 +1118,6 @@
           </w:p>
         </w:tc>
         <w:tc>
-          <w:tcPr/>
           <w:p>
             <w:pPr>
               <w:pStyle w:val="Compact"/>
@@ -1191,22 +1130,21 @@
         </w:tc>
       </w:tr>
     </w:tbl>
-    <w:bookmarkEnd w:id="21"/>
-    <w:bookmarkStart w:id="22" w:name="X2b8ca852ba3168830a28a5d239ee39894d26276"/>
     <w:p>
       <w:pPr>
         <w:pStyle w:val="Heading1"/>
       </w:pPr>
+      <w:bookmarkStart w:id="22" w:name="X2b8ca852ba3168830a28a5d239ee39894d26276"/>
       <w:r>
         <w:t xml:space="preserve">3. Existing project documents (already in the repository)</w:t>
       </w:r>
+      <w:bookmarkEnd w:id="22"/>
     </w:p>
     <w:tbl>
       <w:tblPr>
         <w:tblStyle w:val="Table"/>
-        <w:tblW w:type="pct" w:w="5000"/>
-        <w:tblLook w:firstRow="1" w:lastRow="0" w:firstColumn="0" w:lastColumn="0" w:noHBand="0" w:noVBand="0" w:val="0020"/>
-        <w:jc w:val="start"/>
+        <w:tblW w:type="pct" w:w="5000.0"/>
+        <w:tblLook w:firstRow="1"/>
       </w:tblPr>
       <w:tblGrid>
         <w:gridCol w:w="1675"/>
@@ -1215,12 +1153,14 @@
       </w:tblGrid>
       <w:tr>
         <w:trPr>
-          <w:tblHeader w:val="true"/>
-          <w:tblHeader w:val="true"/>
+          <w:cnfStyle w:firstRow="1"/>
         </w:trPr>
         <w:tc>
           <w:tcPr>
-            <w:shd w:val="clear" w:color="auto" w:fill="1E60AE"/>
+            <w:tcBorders>
+              <w:bottom w:val="single"/>
+            </w:tcBorders>
+            <w:vAlign w:val="bottom"/>
           </w:tcPr>
           <w:p>
             <w:pPr>
@@ -1228,17 +1168,16 @@
               <w:jc w:val="left"/>
             </w:pPr>
             <w:r>
-              <w:rPr>
-                <w:b/>
-                <w:color w:val="FFFFFF"/>
-              </w:rPr>
               <w:t xml:space="preserve">Document</w:t>
             </w:r>
           </w:p>
         </w:tc>
         <w:tc>
           <w:tcPr>
-            <w:shd w:val="clear" w:color="auto" w:fill="1E60AE"/>
+            <w:tcBorders>
+              <w:bottom w:val="single"/>
+            </w:tcBorders>
+            <w:vAlign w:val="bottom"/>
           </w:tcPr>
           <w:p>
             <w:pPr>
@@ -1246,17 +1185,16 @@
               <w:jc w:val="left"/>
             </w:pPr>
             <w:r>
-              <w:rPr>
-                <w:b/>
-                <w:color w:val="FFFFFF"/>
-              </w:rPr>
               <w:t xml:space="preserve">Location</w:t>
             </w:r>
           </w:p>
         </w:tc>
         <w:tc>
           <w:tcPr>
-            <w:shd w:val="clear" w:color="auto" w:fill="1E60AE"/>
+            <w:tcBorders>
+              <w:bottom w:val="single"/>
+            </w:tcBorders>
+            <w:vAlign w:val="bottom"/>
           </w:tcPr>
           <w:p>
             <w:pPr>
@@ -1264,10 +1202,6 @@
               <w:jc w:val="left"/>
             </w:pPr>
             <w:r>
-              <w:rPr>
-                <w:b/>
-                <w:color w:val="FFFFFF"/>
-              </w:rPr>
               <w:t xml:space="preserve">Purpose</w:t>
             </w:r>
           </w:p>
@@ -1275,7 +1209,6 @@
       </w:tr>
       <w:tr>
         <w:tc>
-          <w:tcPr/>
           <w:p>
             <w:pPr>
               <w:pStyle w:val="Compact"/>
@@ -1287,7 +1220,6 @@
           </w:p>
         </w:tc>
         <w:tc>
-          <w:tcPr/>
           <w:p>
             <w:pPr>
               <w:pStyle w:val="Compact"/>
@@ -1302,7 +1234,6 @@
           </w:p>
         </w:tc>
         <w:tc>
-          <w:tcPr/>
           <w:p>
             <w:pPr>
               <w:pStyle w:val="Compact"/>
@@ -1316,7 +1247,6 @@
       </w:tr>
       <w:tr>
         <w:tc>
-          <w:tcPr/>
           <w:p>
             <w:pPr>
               <w:pStyle w:val="Compact"/>
@@ -1328,7 +1258,6 @@
           </w:p>
         </w:tc>
         <w:tc>
-          <w:tcPr/>
           <w:p>
             <w:pPr>
               <w:pStyle w:val="Compact"/>
@@ -1343,7 +1272,6 @@
           </w:p>
         </w:tc>
         <w:tc>
-          <w:tcPr/>
           <w:p>
             <w:pPr>
               <w:pStyle w:val="Compact"/>
@@ -1357,7 +1285,6 @@
       </w:tr>
       <w:tr>
         <w:tc>
-          <w:tcPr/>
           <w:p>
             <w:pPr>
               <w:pStyle w:val="Compact"/>
@@ -1369,7 +1296,6 @@
           </w:p>
         </w:tc>
         <w:tc>
-          <w:tcPr/>
           <w:p>
             <w:pPr>
               <w:pStyle w:val="Compact"/>
@@ -1384,7 +1310,6 @@
           </w:p>
         </w:tc>
         <w:tc>
-          <w:tcPr/>
           <w:p>
             <w:pPr>
               <w:pStyle w:val="Compact"/>
@@ -1398,7 +1323,6 @@
       </w:tr>
       <w:tr>
         <w:tc>
-          <w:tcPr/>
           <w:p>
             <w:pPr>
               <w:pStyle w:val="Compact"/>
@@ -1410,7 +1334,6 @@
           </w:p>
         </w:tc>
         <w:tc>
-          <w:tcPr/>
           <w:p>
             <w:pPr>
               <w:pStyle w:val="Compact"/>
@@ -1425,7 +1348,6 @@
           </w:p>
         </w:tc>
         <w:tc>
-          <w:tcPr/>
           <w:p>
             <w:pPr>
               <w:pStyle w:val="Compact"/>
@@ -1439,7 +1361,6 @@
       </w:tr>
       <w:tr>
         <w:tc>
-          <w:tcPr/>
           <w:p>
             <w:pPr>
               <w:pStyle w:val="Compact"/>
@@ -1451,7 +1372,6 @@
           </w:p>
         </w:tc>
         <w:tc>
-          <w:tcPr/>
           <w:p>
             <w:pPr>
               <w:pStyle w:val="Compact"/>
@@ -1466,7 +1386,6 @@
           </w:p>
         </w:tc>
         <w:tc>
-          <w:tcPr/>
           <w:p>
             <w:pPr>
               <w:pStyle w:val="Compact"/>
@@ -1480,7 +1399,6 @@
       </w:tr>
       <w:tr>
         <w:tc>
-          <w:tcPr/>
           <w:p>
             <w:pPr>
               <w:pStyle w:val="Compact"/>
@@ -1492,7 +1410,6 @@
           </w:p>
         </w:tc>
         <w:tc>
-          <w:tcPr/>
           <w:p>
             <w:pPr>
               <w:pStyle w:val="Compact"/>
@@ -1507,7 +1424,6 @@
           </w:p>
         </w:tc>
         <w:tc>
-          <w:tcPr/>
           <w:p>
             <w:pPr>
               <w:pStyle w:val="Compact"/>
@@ -1521,7 +1437,6 @@
       </w:tr>
       <w:tr>
         <w:tc>
-          <w:tcPr/>
           <w:p>
             <w:pPr>
               <w:pStyle w:val="Compact"/>
@@ -1533,7 +1448,6 @@
           </w:p>
         </w:tc>
         <w:tc>
-          <w:tcPr/>
           <w:p>
             <w:pPr>
               <w:pStyle w:val="Compact"/>
@@ -1563,7 +1477,6 @@
           </w:p>
         </w:tc>
         <w:tc>
-          <w:tcPr/>
           <w:p>
             <w:pPr>
               <w:pStyle w:val="Compact"/>
@@ -1571,61 +1484,20 @@
             </w:pPr>
             <w:r>
               <w:t xml:space="preserve">Inventory, reference matrix, design system, data flow, screen contracts, universe, HighBond comparison</w:t>
-            </w:r>
-          </w:p>
-        </w:tc>
-      </w:tr>
-      <w:tr>
-        <w:tc>
-          <w:tcPr/>
-          <w:p>
-            <w:pPr>
-              <w:pStyle w:val="Compact"/>
-              <w:jc w:val="left"/>
-            </w:pPr>
-            <w:r>
-              <w:t xml:space="preserve">QA report</w:t>
-            </w:r>
-          </w:p>
-        </w:tc>
-        <w:tc>
-          <w:tcPr/>
-          <w:p>
-            <w:pPr>
-              <w:pStyle w:val="Compact"/>
-              <w:jc w:val="left"/>
-            </w:pPr>
-            <w:r>
-              <w:rPr>
-                <w:rStyle w:val="VerbatimChar"/>
-              </w:rPr>
-              <w:t xml:space="preserve">docs/qa/2026-10-15-e2e-qa-report.md</w:t>
-            </w:r>
-          </w:p>
-        </w:tc>
-        <w:tc>
-          <w:tcPr/>
-          <w:p>
-            <w:pPr>
-              <w:pStyle w:val="Compact"/>
-              <w:jc w:val="left"/>
-            </w:pPr>
-            <w:r>
-              <w:t xml:space="preserve">End-to-end test results, findings, risk-engine assessment, go/no-go</w:t>
             </w:r>
           </w:p>
         </w:tc>
       </w:tr>
     </w:tbl>
-    <w:bookmarkEnd w:id="22"/>
-    <w:bookmarkStart w:id="23" w:name="X145fca60e9b8beb1fcb4ecf3d45fb550dd47029"/>
     <w:p>
       <w:pPr>
         <w:pStyle w:val="Heading1"/>
       </w:pPr>
+      <w:bookmarkStart w:id="23" w:name="X145fca60e9b8beb1fcb4ecf3d45fb550dd47029"/>
       <w:r>
         <w:t xml:space="preserve">4. Documents GPHA still needs to produce or approve</w:t>
       </w:r>
+      <w:bookmarkEnd w:id="23"/>
     </w:p>
     <w:p>
       <w:pPr>
@@ -1638,9 +1510,8 @@
     <w:tbl>
       <w:tblPr>
         <w:tblStyle w:val="Table"/>
-        <w:tblW w:type="pct" w:w="5000"/>
-        <w:tblLook w:firstRow="1" w:lastRow="0" w:firstColumn="0" w:lastColumn="0" w:noHBand="0" w:noVBand="0" w:val="0020"/>
-        <w:jc w:val="start"/>
+        <w:tblW w:type="pct" w:w="5000.0"/>
+        <w:tblLook w:firstRow="1"/>
       </w:tblPr>
       <w:tblGrid>
         <w:gridCol w:w="2270"/>
@@ -1650,12 +1521,14 @@
       </w:tblGrid>
       <w:tr>
         <w:trPr>
-          <w:tblHeader w:val="true"/>
-          <w:tblHeader w:val="true"/>
+          <w:cnfStyle w:firstRow="1"/>
         </w:trPr>
         <w:tc>
           <w:tcPr>
-            <w:shd w:val="clear" w:color="auto" w:fill="1E60AE"/>
+            <w:tcBorders>
+              <w:bottom w:val="single"/>
+            </w:tcBorders>
+            <w:vAlign w:val="bottom"/>
           </w:tcPr>
           <w:p>
             <w:pPr>
@@ -1663,17 +1536,16 @@
               <w:jc w:val="left"/>
             </w:pPr>
             <w:r>
-              <w:rPr>
-                <w:b/>
-                <w:color w:val="FFFFFF"/>
-              </w:rPr>
               <w:t xml:space="preserve">Document</w:t>
             </w:r>
           </w:p>
         </w:tc>
         <w:tc>
           <w:tcPr>
-            <w:shd w:val="clear" w:color="auto" w:fill="1E60AE"/>
+            <w:tcBorders>
+              <w:bottom w:val="single"/>
+            </w:tcBorders>
+            <w:vAlign w:val="bottom"/>
           </w:tcPr>
           <w:p>
             <w:pPr>
@@ -1681,17 +1553,16 @@
               <w:jc w:val="left"/>
             </w:pPr>
             <w:r>
-              <w:rPr>
-                <w:b/>
-                <w:color w:val="FFFFFF"/>
-              </w:rPr>
               <w:t xml:space="preserve">Why it is needed</w:t>
             </w:r>
           </w:p>
         </w:tc>
         <w:tc>
           <w:tcPr>
-            <w:shd w:val="clear" w:color="auto" w:fill="1E60AE"/>
+            <w:tcBorders>
+              <w:bottom w:val="single"/>
+            </w:tcBorders>
+            <w:vAlign w:val="bottom"/>
           </w:tcPr>
           <w:p>
             <w:pPr>
@@ -1699,17 +1570,16 @@
               <w:jc w:val="left"/>
             </w:pPr>
             <w:r>
-              <w:rPr>
-                <w:b/>
-                <w:color w:val="FFFFFF"/>
-              </w:rPr>
               <w:t xml:space="preserve">Owner (suggested)</w:t>
             </w:r>
           </w:p>
         </w:tc>
         <w:tc>
           <w:tcPr>
-            <w:shd w:val="clear" w:color="auto" w:fill="1E60AE"/>
+            <w:tcBorders>
+              <w:bottom w:val="single"/>
+            </w:tcBorders>
+            <w:vAlign w:val="bottom"/>
           </w:tcPr>
           <w:p>
             <w:pPr>
@@ -1717,10 +1587,6 @@
               <w:jc w:val="left"/>
             </w:pPr>
             <w:r>
-              <w:rPr>
-                <w:b/>
-                <w:color w:val="FFFFFF"/>
-              </w:rPr>
               <w:t xml:space="preserve">Template / source</w:t>
             </w:r>
           </w:p>
@@ -1728,7 +1594,6 @@
       </w:tr>
       <w:tr>
         <w:tc>
-          <w:tcPr/>
           <w:p>
             <w:pPr>
               <w:pStyle w:val="Compact"/>
@@ -1740,7 +1605,6 @@
           </w:p>
         </w:tc>
         <w:tc>
-          <w:tcPr/>
           <w:p>
             <w:pPr>
               <w:pStyle w:val="Compact"/>
@@ -1752,7 +1616,6 @@
           </w:p>
         </w:tc>
         <w:tc>
-          <w:tcPr/>
           <w:p>
             <w:pPr>
               <w:pStyle w:val="Compact"/>
@@ -1764,7 +1627,6 @@
           </w:p>
         </w:tc>
         <w:tc>
-          <w:tcPr/>
           <w:p>
             <w:pPr>
               <w:pStyle w:val="Compact"/>
@@ -1778,7 +1640,6 @@
       </w:tr>
       <w:tr>
         <w:tc>
-          <w:tcPr/>
           <w:p>
             <w:pPr>
               <w:pStyle w:val="Compact"/>
@@ -1790,7 +1651,6 @@
           </w:p>
         </w:tc>
         <w:tc>
-          <w:tcPr/>
           <w:p>
             <w:pPr>
               <w:pStyle w:val="Compact"/>
@@ -1802,7 +1662,6 @@
           </w:p>
         </w:tc>
         <w:tc>
-          <w:tcPr/>
           <w:p>
             <w:pPr>
               <w:pStyle w:val="Compact"/>
@@ -1814,7 +1673,6 @@
           </w:p>
         </w:tc>
         <w:tc>
-          <w:tcPr/>
           <w:p>
             <w:pPr>
               <w:pStyle w:val="Compact"/>
@@ -1828,7 +1686,6 @@
       </w:tr>
       <w:tr>
         <w:tc>
-          <w:tcPr/>
           <w:p>
             <w:pPr>
               <w:pStyle w:val="Compact"/>
@@ -1840,7 +1697,6 @@
           </w:p>
         </w:tc>
         <w:tc>
-          <w:tcPr/>
           <w:p>
             <w:pPr>
               <w:pStyle w:val="Compact"/>
@@ -1852,7 +1708,6 @@
           </w:p>
         </w:tc>
         <w:tc>
-          <w:tcPr/>
           <w:p>
             <w:pPr>
               <w:pStyle w:val="Compact"/>
@@ -1864,7 +1719,6 @@
           </w:p>
         </w:tc>
         <w:tc>
-          <w:tcPr/>
           <w:p>
             <w:pPr>
               <w:pStyle w:val="Compact"/>
@@ -1878,7 +1732,6 @@
       </w:tr>
       <w:tr>
         <w:tc>
-          <w:tcPr/>
           <w:p>
             <w:pPr>
               <w:pStyle w:val="Compact"/>
@@ -1890,7 +1743,6 @@
           </w:p>
         </w:tc>
         <w:tc>
-          <w:tcPr/>
           <w:p>
             <w:pPr>
               <w:pStyle w:val="Compact"/>
@@ -1902,7 +1754,6 @@
           </w:p>
         </w:tc>
         <w:tc>
-          <w:tcPr/>
           <w:p>
             <w:pPr>
               <w:pStyle w:val="Compact"/>
@@ -1914,7 +1765,6 @@
           </w:p>
         </w:tc>
         <w:tc>
-          <w:tcPr/>
           <w:p>
             <w:pPr>
               <w:pStyle w:val="Compact"/>
@@ -1928,7 +1778,6 @@
       </w:tr>
       <w:tr>
         <w:tc>
-          <w:tcPr/>
           <w:p>
             <w:pPr>
               <w:pStyle w:val="Compact"/>
@@ -1940,7 +1789,6 @@
           </w:p>
         </w:tc>
         <w:tc>
-          <w:tcPr/>
           <w:p>
             <w:pPr>
               <w:pStyle w:val="Compact"/>
@@ -1952,7 +1800,6 @@
           </w:p>
         </w:tc>
         <w:tc>
-          <w:tcPr/>
           <w:p>
             <w:pPr>
               <w:pStyle w:val="Compact"/>
@@ -1964,7 +1811,6 @@
           </w:p>
         </w:tc>
         <w:tc>
-          <w:tcPr/>
           <w:p>
             <w:pPr>
               <w:pStyle w:val="Compact"/>
@@ -1978,7 +1824,6 @@
       </w:tr>
       <w:tr>
         <w:tc>
-          <w:tcPr/>
           <w:p>
             <w:pPr>
               <w:pStyle w:val="Compact"/>
@@ -1990,7 +1835,6 @@
           </w:p>
         </w:tc>
         <w:tc>
-          <w:tcPr/>
           <w:p>
             <w:pPr>
               <w:pStyle w:val="Compact"/>
@@ -2002,7 +1846,6 @@
           </w:p>
         </w:tc>
         <w:tc>
-          <w:tcPr/>
           <w:p>
             <w:pPr>
               <w:pStyle w:val="Compact"/>
@@ -2014,7 +1857,6 @@
           </w:p>
         </w:tc>
         <w:tc>
-          <w:tcPr/>
           <w:p>
             <w:pPr>
               <w:pStyle w:val="Compact"/>
@@ -2028,7 +1870,6 @@
       </w:tr>
       <w:tr>
         <w:tc>
-          <w:tcPr/>
           <w:p>
             <w:pPr>
               <w:pStyle w:val="Compact"/>
@@ -2040,7 +1881,6 @@
           </w:p>
         </w:tc>
         <w:tc>
-          <w:tcPr/>
           <w:p>
             <w:pPr>
               <w:pStyle w:val="Compact"/>
@@ -2052,7 +1892,6 @@
           </w:p>
         </w:tc>
         <w:tc>
-          <w:tcPr/>
           <w:p>
             <w:pPr>
               <w:pStyle w:val="Compact"/>
@@ -2064,7 +1903,6 @@
           </w:p>
         </w:tc>
         <w:tc>
-          <w:tcPr/>
           <w:p>
             <w:pPr>
               <w:pStyle w:val="Compact"/>
@@ -2078,7 +1916,6 @@
       </w:tr>
       <w:tr>
         <w:tc>
-          <w:tcPr/>
           <w:p>
             <w:pPr>
               <w:pStyle w:val="Compact"/>
@@ -2090,7 +1927,6 @@
           </w:p>
         </w:tc>
         <w:tc>
-          <w:tcPr/>
           <w:p>
             <w:pPr>
               <w:pStyle w:val="Compact"/>
@@ -2102,7 +1938,6 @@
           </w:p>
         </w:tc>
         <w:tc>
-          <w:tcPr/>
           <w:p>
             <w:pPr>
               <w:pStyle w:val="Compact"/>
@@ -2114,7 +1949,6 @@
           </w:p>
         </w:tc>
         <w:tc>
-          <w:tcPr/>
           <w:p>
             <w:pPr>
               <w:pStyle w:val="Compact"/>
@@ -2128,7 +1962,6 @@
       </w:tr>
       <w:tr>
         <w:tc>
-          <w:tcPr/>
           <w:p>
             <w:pPr>
               <w:pStyle w:val="Compact"/>
@@ -2140,7 +1973,6 @@
           </w:p>
         </w:tc>
         <w:tc>
-          <w:tcPr/>
           <w:p>
             <w:pPr>
               <w:pStyle w:val="Compact"/>
@@ -2152,7 +1984,6 @@
           </w:p>
         </w:tc>
         <w:tc>
-          <w:tcPr/>
           <w:p>
             <w:pPr>
               <w:pStyle w:val="Compact"/>
@@ -2164,7 +1995,6 @@
           </w:p>
         </w:tc>
         <w:tc>
-          <w:tcPr/>
           <w:p>
             <w:pPr>
               <w:pStyle w:val="Compact"/>
@@ -2178,7 +2008,6 @@
       </w:tr>
       <w:tr>
         <w:tc>
-          <w:tcPr/>
           <w:p>
             <w:pPr>
               <w:pStyle w:val="Compact"/>
@@ -2190,7 +2019,6 @@
           </w:p>
         </w:tc>
         <w:tc>
-          <w:tcPr/>
           <w:p>
             <w:pPr>
               <w:pStyle w:val="Compact"/>
@@ -2202,7 +2030,6 @@
           </w:p>
         </w:tc>
         <w:tc>
-          <w:tcPr/>
           <w:p>
             <w:pPr>
               <w:pStyle w:val="Compact"/>
@@ -2214,7 +2041,6 @@
           </w:p>
         </w:tc>
         <w:tc>
-          <w:tcPr/>
           <w:p>
             <w:pPr>
               <w:pStyle w:val="Compact"/>
@@ -2228,7 +2054,6 @@
       </w:tr>
       <w:tr>
         <w:tc>
-          <w:tcPr/>
           <w:p>
             <w:pPr>
               <w:pStyle w:val="Compact"/>
@@ -2240,7 +2065,6 @@
           </w:p>
         </w:tc>
         <w:tc>
-          <w:tcPr/>
           <w:p>
             <w:pPr>
               <w:pStyle w:val="Compact"/>
@@ -2252,7 +2076,6 @@
           </w:p>
         </w:tc>
         <w:tc>
-          <w:tcPr/>
           <w:p>
             <w:pPr>
               <w:pStyle w:val="Compact"/>
@@ -2264,7 +2087,6 @@
           </w:p>
         </w:tc>
         <w:tc>
-          <w:tcPr/>
           <w:p>
             <w:pPr>
               <w:pStyle w:val="Compact"/>
@@ -2277,15 +2099,15 @@
         </w:tc>
       </w:tr>
     </w:tbl>
-    <w:bookmarkEnd w:id="23"/>
-    <w:bookmarkStart w:id="24" w:name="keeping-the-documentation-current"/>
     <w:p>
       <w:pPr>
         <w:pStyle w:val="Heading1"/>
       </w:pPr>
+      <w:bookmarkStart w:id="24" w:name="keeping-the-documentation-current"/>
       <w:r>
         <w:t xml:space="preserve">5. Keeping the documentation current</w:t>
       </w:r>
+      <w:bookmarkEnd w:id="24"/>
     </w:p>
     <w:p>
       <w:pPr>
@@ -2360,7 +2182,6 @@
       </w:r>
       <w:r>
         <w:rPr>
-          <w:iCs/>
           <w:i/>
         </w:rPr>
         <w:t xml:space="preserve">Document control</w:t>
@@ -2372,15 +2193,15 @@
         <w:t xml:space="preserve">table.</w:t>
       </w:r>
     </w:p>
-    <w:bookmarkEnd w:id="24"/>
-    <w:bookmarkStart w:id="25" w:name="how-the-word-files-are-produced"/>
     <w:p>
       <w:pPr>
         <w:pStyle w:val="Heading1"/>
       </w:pPr>
+      <w:bookmarkStart w:id="25" w:name="how-the-word-files-are-produced"/>
       <w:r>
         <w:t xml:space="preserve">6. How the Word files are produced</w:t>
       </w:r>
+      <w:bookmarkEnd w:id="25"/>
     </w:p>
     <w:p>
       <w:pPr>
@@ -2433,10 +2254,9 @@
         <w:t xml:space="preserve">holds the GPHA styles: fonts, heading colours and table style.</w:t>
       </w:r>
     </w:p>
-    <w:bookmarkEnd w:id="25"/>
     <w:sectPr>
-      <w:footerReference r:id="rId9" w:type="default"/>
-      <w:pgMar w:bottom="1020" w:left="1134" w:right="1134" w:top="1134"/>
+      <w:footerReference w:type="default" r:id="rId9"/>
+      <w:pgMar w:left="1134" w:right="1134" w:top="1134" w:bottom="1020"/>
     </w:sectPr>
   </w:body>
 </w:document>
@@ -2493,14 +2313,17 @@
 <file path=word/numbering.xml><?xml version="1.0" encoding="utf-8"?>
 <w:numbering xmlns:w="http://schemas.openxmlformats.org/wordprocessingml/2006/main">
   <w:abstractNum w:abstractNumId="990">
-    <w:nsid w:val="A990"/>
+    <w:nsid w:val="2c1ae401"/>
     <w:multiLevelType w:val="multilevel"/>
     <w:lvl w:ilvl="0">
       <w:numFmt w:val="bullet"/>
       <w:lvlText w:val=" "/>
       <w:lvlJc w:val="left"/>
       <w:pPr>
-        <w:ind w:left="720" w:hanging="480"/>
+        <w:tabs>
+          <w:tab w:val="num" w:pos="0"/>
+        </w:tabs>
+        <w:ind w:left="480" w:hanging="480"/>
       </w:pPr>
     </w:lvl>
     <w:lvl w:ilvl="1">
@@ -2508,7 +2331,10 @@
       <w:lvlText w:val=" "/>
       <w:lvlJc w:val="left"/>
       <w:pPr>
-        <w:ind w:left="1440" w:hanging="480"/>
+        <w:tabs>
+          <w:tab w:val="num" w:pos="720"/>
+        </w:tabs>
+        <w:ind w:left="1200" w:hanging="480"/>
       </w:pPr>
     </w:lvl>
     <w:lvl w:ilvl="2">
@@ -2516,7 +2342,10 @@
       <w:lvlText w:val=" "/>
       <w:lvlJc w:val="left"/>
       <w:pPr>
-        <w:ind w:left="2160" w:hanging="480"/>
+        <w:tabs>
+          <w:tab w:val="num" w:pos="1440"/>
+        </w:tabs>
+        <w:ind w:left="1920" w:hanging="480"/>
       </w:pPr>
     </w:lvl>
     <w:lvl w:ilvl="3">
@@ -2524,7 +2353,10 @@
       <w:lvlText w:val=" "/>
       <w:lvlJc w:val="left"/>
       <w:pPr>
-        <w:ind w:left="2880" w:hanging="480"/>
+        <w:tabs>
+          <w:tab w:val="num" w:pos="2160"/>
+        </w:tabs>
+        <w:ind w:left="2640" w:hanging="480"/>
       </w:pPr>
     </w:lvl>
     <w:lvl w:ilvl="4">
@@ -2532,7 +2364,10 @@
       <w:lvlText w:val=" "/>
       <w:lvlJc w:val="left"/>
       <w:pPr>
-        <w:ind w:left="3600" w:hanging="480"/>
+        <w:tabs>
+          <w:tab w:val="num" w:pos="2880"/>
+        </w:tabs>
+        <w:ind w:left="3360" w:hanging="480"/>
       </w:pPr>
     </w:lvl>
     <w:lvl w:ilvl="5">
@@ -2540,7 +2375,10 @@
       <w:lvlText w:val=" "/>
       <w:lvlJc w:val="left"/>
       <w:pPr>
-        <w:ind w:left="4320" w:hanging="480"/>
+        <w:tabs>
+          <w:tab w:val="num" w:pos="3600"/>
+        </w:tabs>
+        <w:ind w:left="4080" w:hanging="480"/>
       </w:pPr>
     </w:lvl>
     <w:lvl w:ilvl="6">
@@ -2548,7 +2386,10 @@
       <w:lvlText w:val=" "/>
       <w:lvlJc w:val="left"/>
       <w:pPr>
-        <w:ind w:left="5040" w:hanging="480"/>
+        <w:tabs>
+          <w:tab w:val="num" w:pos="4320"/>
+        </w:tabs>
+        <w:ind w:left="4800" w:hanging="480"/>
       </w:pPr>
     </w:lvl>
     <w:lvl w:ilvl="7">
@@ -2556,7 +2397,10 @@
       <w:lvlText w:val=" "/>
       <w:lvlJc w:val="left"/>
       <w:pPr>
-        <w:ind w:left="5760" w:hanging="480"/>
+        <w:tabs>
+          <w:tab w:val="num" w:pos="5040"/>
+        </w:tabs>
+        <w:ind w:left="5520" w:hanging="480"/>
       </w:pPr>
     </w:lvl>
     <w:lvl w:ilvl="8">
@@ -2564,19 +2408,25 @@
       <w:lvlText w:val=" "/>
       <w:lvlJc w:val="left"/>
       <w:pPr>
-        <w:ind w:left="6480" w:hanging="480"/>
+        <w:tabs>
+          <w:tab w:val="num" w:pos="5760"/>
+        </w:tabs>
+        <w:ind w:left="6240" w:hanging="480"/>
       </w:pPr>
     </w:lvl>
   </w:abstractNum>
   <w:abstractNum w:abstractNumId="991">
-    <w:nsid w:val="A991"/>
+    <w:nsid w:val="ea454b4c"/>
     <w:multiLevelType w:val="multilevel"/>
     <w:lvl w:ilvl="0">
       <w:numFmt w:val="bullet"/>
       <w:lvlText w:val="•"/>
       <w:lvlJc w:val="left"/>
       <w:pPr>
-        <w:ind w:left="720" w:hanging="480"/>
+        <w:tabs>
+          <w:tab w:val="num" w:pos="0"/>
+        </w:tabs>
+        <w:ind w:left="480" w:hanging="480"/>
       </w:pPr>
     </w:lvl>
     <w:lvl w:ilvl="1">
@@ -2584,7 +2434,10 @@
       <w:lvlText w:val="–"/>
       <w:lvlJc w:val="left"/>
       <w:pPr>
-        <w:ind w:left="1440" w:hanging="480"/>
+        <w:tabs>
+          <w:tab w:val="num" w:pos="720"/>
+        </w:tabs>
+        <w:ind w:left="1200" w:hanging="480"/>
       </w:pPr>
     </w:lvl>
     <w:lvl w:ilvl="2">
@@ -2592,7 +2445,10 @@
       <w:lvlText w:val="•"/>
       <w:lvlJc w:val="left"/>
       <w:pPr>
-        <w:ind w:left="2160" w:hanging="480"/>
+        <w:tabs>
+          <w:tab w:val="num" w:pos="1440"/>
+        </w:tabs>
+        <w:ind w:left="1920" w:hanging="480"/>
       </w:pPr>
     </w:lvl>
     <w:lvl w:ilvl="3">
@@ -2600,7 +2456,10 @@
       <w:lvlText w:val="–"/>
       <w:lvlJc w:val="left"/>
       <w:pPr>
-        <w:ind w:left="2880" w:hanging="480"/>
+        <w:tabs>
+          <w:tab w:val="num" w:pos="2160"/>
+        </w:tabs>
+        <w:ind w:left="2640" w:hanging="480"/>
       </w:pPr>
     </w:lvl>
     <w:lvl w:ilvl="4">
@@ -2608,7 +2467,10 @@
       <w:lvlText w:val="•"/>
       <w:lvlJc w:val="left"/>
       <w:pPr>
-        <w:ind w:left="3600" w:hanging="480"/>
+        <w:tabs>
+          <w:tab w:val="num" w:pos="2880"/>
+        </w:tabs>
+        <w:ind w:left="3360" w:hanging="480"/>
       </w:pPr>
     </w:lvl>
     <w:lvl w:ilvl="5">
@@ -2616,7 +2478,10 @@
       <w:lvlText w:val="–"/>
       <w:lvlJc w:val="left"/>
       <w:pPr>
-        <w:ind w:left="4320" w:hanging="480"/>
+        <w:tabs>
+          <w:tab w:val="num" w:pos="3600"/>
+        </w:tabs>
+        <w:ind w:left="4080" w:hanging="480"/>
       </w:pPr>
     </w:lvl>
     <w:lvl w:ilvl="6">
@@ -2624,7 +2489,10 @@
       <w:lvlText w:val="•"/>
       <w:lvlJc w:val="left"/>
       <w:pPr>
-        <w:ind w:left="5040" w:hanging="480"/>
+        <w:tabs>
+          <w:tab w:val="num" w:pos="4320"/>
+        </w:tabs>
+        <w:ind w:left="4800" w:hanging="480"/>
       </w:pPr>
     </w:lvl>
     <w:lvl w:ilvl="7">
@@ -2632,7 +2500,10 @@
       <w:lvlText w:val="–"/>
       <w:lvlJc w:val="left"/>
       <w:pPr>
-        <w:ind w:left="5760" w:hanging="480"/>
+        <w:tabs>
+          <w:tab w:val="num" w:pos="5040"/>
+        </w:tabs>
+        <w:ind w:left="5520" w:hanging="480"/>
       </w:pPr>
     </w:lvl>
     <w:lvl w:ilvl="8">
@@ -2640,7 +2511,10 @@
       <w:lvlText w:val="•"/>
       <w:lvlJc w:val="left"/>
       <w:pPr>
-        <w:ind w:left="6480" w:hanging="480"/>
+        <w:tabs>
+          <w:tab w:val="num" w:pos="5760"/>
+        </w:tabs>
+        <w:ind w:left="6240" w:hanging="480"/>
       </w:pPr>
     </w:lvl>
   </w:abstractNum>
@@ -2658,10 +2532,10 @@
   <w:docDefaults>
     <w:rPrDefault>
       <w:rPr>
-        <w:rFonts w:asciiTheme="minorHAnsi" w:cstheme="minorBidi" w:eastAsiaTheme="minorHAnsi" w:hAnsiTheme="minorHAnsi"/>
+        <w:rFonts w:asciiTheme="minorHAnsi" w:eastAsiaTheme="minorHAnsi" w:hAnsiTheme="minorHAnsi" w:cstheme="minorBidi"/>
         <w:sz w:val="24"/>
         <w:szCs w:val="24"/>
-        <w:lang w:bidi="ar-SA" w:eastAsia="en-US" w:val="en-US"/>
+        <w:lang w:val="en-US" w:eastAsia="en-US" w:bidi="ar-SA"/>
       </w:rPr>
     </w:rPrDefault>
     <w:pPrDefault>
@@ -2670,55 +2544,55 @@
       </w:pPr>
     </w:pPrDefault>
   </w:docDefaults>
-  <w:latentStyles w:count="276" w:defLockedState="0" w:defQFormat="0" w:defSemiHidden="0" w:defUIPriority="0" w:defUnhideWhenUsed="0"/>
-  <w:style w:default="1" w:styleId="Normal" w:type="paragraph">
+  <w:latentStyles w:defLockedState="0" w:defUIPriority="0" w:defSemiHidden="0" w:defUnhideWhenUsed="0" w:defQFormat="0" w:count="276"/>
+  <w:style w:type="paragraph" w:default="1" w:styleId="Normal">
     <w:name w:val="Normal"/>
     <w:qFormat/>
     <w:rPr>
-      <w:rFonts w:ascii="Calibri" w:cs="Calibri" w:eastAsia="Calibri" w:hAnsi="Calibri"/>
+      <w:rFonts w:ascii="Calibri" w:hAnsi="Calibri" w:cs="Calibri" w:eastAsia="Calibri"/>
       <w:color w:val="344054"/>
       <w:sz w:val="21"/>
     </w:rPr>
   </w:style>
-  <w:style w:styleId="BodyText" w:type="paragraph">
+  <w:style w:type="paragraph" w:styleId="BodyText">
     <w:name w:val="Body Text"/>
     <w:basedOn w:val="Normal"/>
     <w:link w:val="BodyTextChar"/>
     <w:pPr>
-      <w:spacing w:after="180" w:before="180"/>
+      <w:spacing w:before="180" w:after="180"/>
     </w:pPr>
     <w:qFormat/>
     <w:rPr>
-      <w:rFonts w:ascii="Calibri" w:cs="Calibri" w:eastAsia="Calibri" w:hAnsi="Calibri"/>
+      <w:rFonts w:ascii="Calibri" w:hAnsi="Calibri" w:cs="Calibri" w:eastAsia="Calibri"/>
       <w:color w:val="344054"/>
       <w:sz w:val="21"/>
     </w:rPr>
   </w:style>
-  <w:style w:customStyle="1" w:styleId="FirstParagraph" w:type="paragraph">
+  <w:style w:type="paragraph" w:customStyle="1" w:styleId="FirstParagraph">
     <w:name w:val="First Paragraph"/>
     <w:basedOn w:val="BodyText"/>
     <w:next w:val="BodyText"/>
     <w:qFormat/>
     <w:rPr>
-      <w:rFonts w:ascii="Calibri" w:cs="Calibri" w:eastAsia="Calibri" w:hAnsi="Calibri"/>
+      <w:rFonts w:ascii="Calibri" w:hAnsi="Calibri" w:cs="Calibri" w:eastAsia="Calibri"/>
       <w:color w:val="344054"/>
       <w:sz w:val="21"/>
     </w:rPr>
   </w:style>
-  <w:style w:customStyle="1" w:styleId="Compact" w:type="paragraph">
+  <w:style w:type="paragraph" w:customStyle="1" w:styleId="Compact">
     <w:name w:val="Compact"/>
     <w:basedOn w:val="BodyText"/>
     <w:qFormat/>
     <w:pPr>
-      <w:spacing w:after="36" w:before="36"/>
+      <w:spacing w:before="36" w:after="36"/>
     </w:pPr>
     <w:rPr>
-      <w:rFonts w:ascii="Calibri" w:cs="Calibri" w:eastAsia="Calibri" w:hAnsi="Calibri"/>
+      <w:rFonts w:ascii="Calibri" w:hAnsi="Calibri" w:cs="Calibri" w:eastAsia="Calibri"/>
       <w:color w:val="344054"/>
       <w:sz w:val="21"/>
     </w:rPr>
   </w:style>
-  <w:style w:styleId="Title" w:type="paragraph">
+  <w:style w:type="paragraph" w:styleId="Title">
     <w:name w:val="Title"/>
     <w:basedOn w:val="Normal"/>
     <w:next w:val="BodyText"/>
@@ -2726,11 +2600,11 @@
     <w:pPr>
       <w:keepNext/>
       <w:keepLines/>
-      <w:spacing w:after="240" w:before="480"/>
+      <w:spacing w:before="480" w:after="240"/>
       <w:jc w:val="center"/>
     </w:pPr>
     <w:rPr>
-      <w:rFonts w:ascii="Calibri" w:cs="Calibri" w:eastAsia="Calibri" w:hAnsi="Calibri"/>
+      <w:rFonts w:ascii="Calibri" w:hAnsi="Calibri" w:cs="Calibri" w:eastAsia="Calibri"/>
       <w:b/>
       <w:bCs/>
       <w:color w:val="0F2A4A"/>
@@ -2738,7 +2612,7 @@
       <w:szCs w:val="36"/>
     </w:rPr>
   </w:style>
-  <w:style w:styleId="Subtitle" w:type="paragraph">
+  <w:style w:type="paragraph" w:styleId="Subtitle">
     <w:name w:val="Subtitle"/>
     <w:basedOn w:val="Title"/>
     <w:next w:val="BodyText"/>
@@ -2746,18 +2620,18 @@
     <w:pPr>
       <w:keepNext/>
       <w:keepLines/>
-      <w:spacing w:after="240" w:before="240"/>
+      <w:spacing w:before="240" w:after="240"/>
       <w:jc w:val="center"/>
     </w:pPr>
     <w:rPr>
-      <w:rFonts w:ascii="Calibri" w:cs="Calibri" w:eastAsia="Calibri" w:hAnsi="Calibri"/>
+      <w:rFonts w:ascii="Calibri" w:hAnsi="Calibri" w:cs="Calibri" w:eastAsia="Calibri"/>
       <w:b w:val="0"/>
       <w:color w:val="1E60AE"/>
       <w:sz w:val="28"/>
       <w:szCs w:val="30"/>
     </w:rPr>
   </w:style>
-  <w:style w:customStyle="1" w:styleId="Author" w:type="paragraph">
+  <w:style w:type="paragraph" w:customStyle="1" w:styleId="Author">
     <w:name w:val="Author"/>
     <w:next w:val="BodyText"/>
     <w:qFormat/>
@@ -2767,12 +2641,12 @@
       <w:jc w:val="center"/>
     </w:pPr>
     <w:rPr>
-      <w:rFonts w:ascii="Calibri" w:cs="Calibri" w:eastAsia="Calibri" w:hAnsi="Calibri"/>
+      <w:rFonts w:ascii="Calibri" w:hAnsi="Calibri" w:cs="Calibri" w:eastAsia="Calibri"/>
       <w:color w:val="344054"/>
       <w:sz w:val="22"/>
     </w:rPr>
   </w:style>
-  <w:style w:styleId="Date" w:type="paragraph">
+  <w:style w:type="paragraph" w:styleId="Date">
     <w:name w:val="Date"/>
     <w:next w:val="BodyText"/>
     <w:qFormat/>
@@ -2782,12 +2656,12 @@
       <w:jc w:val="center"/>
     </w:pPr>
     <w:rPr>
-      <w:rFonts w:ascii="Calibri" w:cs="Calibri" w:eastAsia="Calibri" w:hAnsi="Calibri"/>
+      <w:rFonts w:ascii="Calibri" w:hAnsi="Calibri" w:cs="Calibri" w:eastAsia="Calibri"/>
       <w:color w:val="344054"/>
       <w:sz w:val="22"/>
     </w:rPr>
   </w:style>
-  <w:style w:customStyle="1" w:styleId="AbstractTitle" w:type="paragraph">
+  <w:style w:type="paragraph" w:customStyle="1" w:styleId="AbstractTitle">
     <w:name w:val="Abstract Title"/>
     <w:basedOn w:val="Normal"/>
     <w:next w:val="Abstract"/>
@@ -2796,7 +2670,7 @@
       <w:keepNext/>
       <w:keepLines/>
       <w:jc w:val="center"/>
-      <w:spacing w:after="0" w:before="300"/>
+      <w:spacing w:before="300" w:after="0"/>
     </w:pPr>
     <w:rPr>
       <w:sz w:val="20"/>
@@ -2806,7 +2680,7 @@
       &gt;
     </w:rPr>
   </w:style>
-  <w:style w:customStyle="1" w:styleId="Abstract" w:type="paragraph">
+  <w:style w:type="paragraph" w:customStyle="1" w:styleId="Abstract">
     <w:name w:val="Abstract"/>
     <w:basedOn w:val="Normal"/>
     <w:next w:val="BodyText"/>
@@ -2814,14 +2688,14 @@
     <w:pPr>
       <w:keepNext/>
       <w:keepLines/>
-      <w:spacing w:after="300" w:before="100"/>
+      <w:spacing w:before="100" w:after="300"/>
     </w:pPr>
     <w:rPr>
       <w:sz w:val="20"/>
       <w:szCs w:val="20"/>
     </w:rPr>
   </w:style>
-  <w:style w:styleId="Bibliography" w:type="paragraph">
+  <w:style w:type="paragraph" w:styleId="Bibliography">
     <w:name w:val="Bibliography"/>
     <w:basedOn w:val="Normal"/>
     <w:next w:val="Bibliography"/>
@@ -2829,7 +2703,7 @@
     <w:pPr/>
     <w:rPr/>
   </w:style>
-  <w:style w:styleId="Heading1" w:type="paragraph">
+  <w:style w:type="paragraph" w:styleId="Heading1">
     <w:name w:val="Heading 1"/>
     <w:basedOn w:val="Normal"/>
     <w:next w:val="BodyText"/>
@@ -2838,11 +2712,11 @@
     <w:pPr>
       <w:keepNext/>
       <w:keepLines/>
-      <w:spacing w:after="80" w:before="280"/>
+      <w:spacing w:before="280" w:after="80"/>
       <w:outlineLvl w:val="0"/>
     </w:pPr>
     <w:rPr>
-      <w:rFonts w:ascii="Calibri" w:cs="Calibri" w:eastAsia="Calibri" w:hAnsi="Calibri"/>
+      <w:rFonts w:ascii="Calibri" w:hAnsi="Calibri" w:cs="Calibri" w:eastAsia="Calibri"/>
       <w:b/>
       <w:bCs/>
       <w:color w:val="1E60AE"/>
@@ -2850,7 +2724,7 @@
       <w:szCs w:val="32"/>
     </w:rPr>
   </w:style>
-  <w:style w:styleId="Heading2" w:type="paragraph">
+  <w:style w:type="paragraph" w:styleId="Heading2">
     <w:name w:val="Heading 2"/>
     <w:basedOn w:val="Normal"/>
     <w:next w:val="BodyText"/>
@@ -2860,11 +2734,11 @@
     <w:pPr>
       <w:keepNext/>
       <w:keepLines/>
-      <w:spacing w:after="80" w:before="200"/>
+      <w:spacing w:before="200" w:after="80"/>
       <w:outlineLvl w:val="1"/>
     </w:pPr>
     <w:rPr>
-      <w:rFonts w:ascii="Calibri" w:cs="Calibri" w:eastAsia="Calibri" w:hAnsi="Calibri"/>
+      <w:rFonts w:ascii="Calibri" w:hAnsi="Calibri" w:cs="Calibri" w:eastAsia="Calibri"/>
       <w:b/>
       <w:bCs/>
       <w:color w:val="0F2A4A"/>
@@ -2872,7 +2746,7 @@
       <w:szCs w:val="28"/>
     </w:rPr>
   </w:style>
-  <w:style w:styleId="Heading3" w:type="paragraph">
+  <w:style w:type="paragraph" w:styleId="Heading3">
     <w:name w:val="Heading 3"/>
     <w:basedOn w:val="Normal"/>
     <w:next w:val="BodyText"/>
@@ -2882,11 +2756,11 @@
     <w:pPr>
       <w:keepNext/>
       <w:keepLines/>
-      <w:spacing w:after="80" w:before="200"/>
+      <w:spacing w:before="200" w:after="80"/>
       <w:outlineLvl w:val="2"/>
     </w:pPr>
     <w:rPr>
-      <w:rFonts w:ascii="Calibri" w:cs="Calibri" w:eastAsia="Calibri" w:hAnsi="Calibri"/>
+      <w:rFonts w:ascii="Calibri" w:hAnsi="Calibri" w:cs="Calibri" w:eastAsia="Calibri"/>
       <w:b/>
       <w:bCs/>
       <w:color w:val="1E60AE"/>
@@ -2894,7 +2768,7 @@
       <w:szCs w:val="24"/>
     </w:rPr>
   </w:style>
-  <w:style w:styleId="Heading4" w:type="paragraph">
+  <w:style w:type="paragraph" w:styleId="Heading4">
     <w:name w:val="Heading 4"/>
     <w:basedOn w:val="Normal"/>
     <w:next w:val="BodyText"/>
@@ -2904,11 +2778,11 @@
     <w:pPr>
       <w:keepNext/>
       <w:keepLines/>
-      <w:spacing w:after="80" w:before="200"/>
+      <w:spacing w:before="200" w:after="80"/>
       <w:outlineLvl w:val="3"/>
     </w:pPr>
     <w:rPr>
-      <w:rFonts w:ascii="Calibri" w:cs="Calibri" w:eastAsia="Calibri" w:hAnsi="Calibri"/>
+      <w:rFonts w:ascii="Calibri" w:hAnsi="Calibri" w:cs="Calibri" w:eastAsia="Calibri"/>
       <w:i/>
       <w:b/>
       <w:bCs/>
@@ -2917,7 +2791,7 @@
       <w:szCs w:val="24"/>
     </w:rPr>
   </w:style>
-  <w:style w:styleId="Heading5" w:type="paragraph">
+  <w:style w:type="paragraph" w:styleId="Heading5">
     <w:name w:val="Heading 5"/>
     <w:basedOn w:val="Normal"/>
     <w:next w:val="BodyText"/>
@@ -2927,18 +2801,18 @@
     <w:pPr>
       <w:keepNext/>
       <w:keepLines/>
-      <w:spacing w:after="0" w:before="200"/>
+      <w:spacing w:before="200" w:after="0"/>
       <w:outlineLvl w:val="4"/>
     </w:pPr>
     <w:rPr>
-      <w:rFonts w:asciiTheme="majorHAnsi" w:cstheme="majorBidi" w:eastAsiaTheme="majorEastAsia" w:hAnsiTheme="majorHAnsi"/>
+      <w:rFonts w:asciiTheme="majorHAnsi" w:eastAsiaTheme="majorEastAsia" w:hAnsiTheme="majorHAnsi" w:cstheme="majorBidi"/>
       <w:iCs/>
-      <w:color w:themeColor="accent1" w:val="4F81BD"/>
+      <w:color w:val="4F81BD" w:themeColor="accent1"/>
       <w:sz w:val="24"/>
       <w:szCs w:val="24"/>
     </w:rPr>
   </w:style>
-  <w:style w:styleId="Heading6" w:type="paragraph">
+  <w:style w:type="paragraph" w:styleId="Heading6">
     <w:name w:val="Heading 6"/>
     <w:basedOn w:val="Normal"/>
     <w:next w:val="BodyText"/>
@@ -2948,17 +2822,17 @@
     <w:pPr>
       <w:keepNext/>
       <w:keepLines/>
-      <w:spacing w:after="0" w:before="200"/>
+      <w:spacing w:before="200" w:after="0"/>
       <w:outlineLvl w:val="5"/>
     </w:pPr>
     <w:rPr>
-      <w:rFonts w:asciiTheme="majorHAnsi" w:cstheme="majorBidi" w:eastAsiaTheme="majorEastAsia" w:hAnsiTheme="majorHAnsi"/>
-      <w:color w:themeColor="accent1" w:val="4F81BD"/>
+      <w:rFonts w:asciiTheme="majorHAnsi" w:eastAsiaTheme="majorEastAsia" w:hAnsiTheme="majorHAnsi" w:cstheme="majorBidi"/>
+      <w:color w:val="4F81BD" w:themeColor="accent1"/>
       <w:sz w:val="24"/>
       <w:szCs w:val="24"/>
     </w:rPr>
   </w:style>
-  <w:style w:styleId="Heading7" w:type="paragraph">
+  <w:style w:type="paragraph" w:styleId="Heading7">
     <w:name w:val="Heading 7"/>
     <w:basedOn w:val="Normal"/>
     <w:next w:val="BodyText"/>
@@ -2968,17 +2842,17 @@
     <w:pPr>
       <w:keepNext/>
       <w:keepLines/>
-      <w:spacing w:after="0" w:before="200"/>
+      <w:spacing w:before="200" w:after="0"/>
       <w:outlineLvl w:val="6"/>
     </w:pPr>
     <w:rPr>
-      <w:rFonts w:asciiTheme="majorHAnsi" w:cstheme="majorBidi" w:eastAsiaTheme="majorEastAsia" w:hAnsiTheme="majorHAnsi"/>
-      <w:color w:themeColor="accent1" w:val="4F81BD"/>
+      <w:rFonts w:asciiTheme="majorHAnsi" w:eastAsiaTheme="majorEastAsia" w:hAnsiTheme="majorHAnsi" w:cstheme="majorBidi"/>
+      <w:color w:val="4F81BD" w:themeColor="accent1"/>
       <w:sz w:val="24"/>
       <w:szCs w:val="24"/>
     </w:rPr>
   </w:style>
-  <w:style w:styleId="Heading8" w:type="paragraph">
+  <w:style w:type="paragraph" w:styleId="Heading8">
     <w:name w:val="Heading 8"/>
     <w:basedOn w:val="Normal"/>
     <w:next w:val="BodyText"/>
@@ -2988,17 +2862,17 @@
     <w:pPr>
       <w:keepNext/>
       <w:keepLines/>
-      <w:spacing w:after="0" w:before="200"/>
+      <w:spacing w:before="200" w:after="0"/>
       <w:outlineLvl w:val="7"/>
     </w:pPr>
     <w:rPr>
-      <w:rFonts w:asciiTheme="majorHAnsi" w:cstheme="majorBidi" w:eastAsiaTheme="majorEastAsia" w:hAnsiTheme="majorHAnsi"/>
-      <w:color w:themeColor="accent1" w:val="4F81BD"/>
+      <w:rFonts w:asciiTheme="majorHAnsi" w:eastAsiaTheme="majorEastAsia" w:hAnsiTheme="majorHAnsi" w:cstheme="majorBidi"/>
+      <w:color w:val="4F81BD" w:themeColor="accent1"/>
       <w:sz w:val="24"/>
       <w:szCs w:val="24"/>
     </w:rPr>
   </w:style>
-  <w:style w:styleId="Heading9" w:type="paragraph">
+  <w:style w:type="paragraph" w:styleId="Heading9">
     <w:name w:val="Heading 9"/>
     <w:basedOn w:val="Normal"/>
     <w:next w:val="BodyText"/>
@@ -3008,17 +2882,17 @@
     <w:pPr>
       <w:keepNext/>
       <w:keepLines/>
-      <w:spacing w:after="0" w:before="200"/>
+      <w:spacing w:before="200" w:after="0"/>
       <w:outlineLvl w:val="8"/>
     </w:pPr>
     <w:rPr>
-      <w:rFonts w:asciiTheme="majorHAnsi" w:cstheme="majorBidi" w:eastAsiaTheme="majorEastAsia" w:hAnsiTheme="majorHAnsi"/>
-      <w:color w:themeColor="accent1" w:val="4F81BD"/>
+      <w:rFonts w:asciiTheme="majorHAnsi" w:eastAsiaTheme="majorEastAsia" w:hAnsiTheme="majorHAnsi" w:cstheme="majorBidi"/>
+      <w:color w:val="4F81BD" w:themeColor="accent1"/>
       <w:sz w:val="24"/>
       <w:szCs w:val="24"/>
     </w:rPr>
   </w:style>
-  <w:style w:styleId="BlockText" w:type="paragraph">
+  <w:style w:type="paragraph" w:styleId="BlockText">
     <w:name w:val="Block Text"/>
     <w:basedOn w:val="BodyText"/>
     <w:next w:val="BodyText"/>
@@ -3026,11 +2900,11 @@
     <w:unhideWhenUsed/>
     <w:qFormat/>
     <w:pPr>
-      <w:spacing w:after="100" w:before="100"/>
+      <w:spacing w:before="100" w:after="100"/>
       <w:ind w:firstLine="0" w:left="480" w:right="480"/>
     </w:pPr>
   </w:style>
-  <w:style w:styleId="FootnoteText" w:type="paragraph">
+  <w:style w:type="paragraph" w:styleId="FootnoteText">
     <w:name w:val="Footnote Text"/>
     <w:basedOn w:val="Normal"/>
     <w:next w:val="FootnoteText"/>
@@ -3038,32 +2912,32 @@
     <w:unhideWhenUsed/>
     <w:qFormat/>
   </w:style>
-  <w:style w:default="1" w:styleId="DefaultParagraphFont" w:type="character">
+  <w:style w:type="character" w:default="1" w:styleId="DefaultParagraphFont">
     <w:name w:val="Default Paragraph Font"/>
     <w:semiHidden/>
     <w:unhideWhenUsed/>
   </w:style>
-  <w:style w:default="1" w:styleId="Table" w:type="table">
+  <w:style w:type="table" w:default="1" w:styleId="Table">
     <w:name w:val="Table"/>
     <w:basedOn w:val="TableNormal"/>
     <w:semiHidden/>
     <w:unhideWhenUsed/>
     <w:qFormat/>
     <w:tblPr>
-      <w:tblInd w:type="dxa" w:w="0"/>
+      <w:tblInd w:w="0" w:type="dxa"/>
       <w:tblBorders>
-        <w:top w:color="C3CAD6" w:space="0" w:sz="4" w:val="single"/>
-        <w:left w:color="C3CAD6" w:space="0" w:sz="4" w:val="single"/>
-        <w:bottom w:color="C3CAD6" w:space="0" w:sz="4" w:val="single"/>
-        <w:right w:color="C3CAD6" w:space="0" w:sz="4" w:val="single"/>
-        <w:insideH w:color="C3CAD6" w:space="0" w:sz="4" w:val="single"/>
-        <w:insideV w:color="C3CAD6" w:space="0" w:sz="4" w:val="single"/>
+        <w:top w:val="single" w:sz="4" w:space="0" w:color="C3CAD6"/>
+        <w:left w:val="single" w:sz="4" w:space="0" w:color="C3CAD6"/>
+        <w:bottom w:val="single" w:sz="4" w:space="0" w:color="C3CAD6"/>
+        <w:right w:val="single" w:sz="4" w:space="0" w:color="C3CAD6"/>
+        <w:insideH w:val="single" w:sz="4" w:space="0" w:color="C3CAD6"/>
+        <w:insideV w:val="single" w:sz="4" w:space="0" w:color="C3CAD6"/>
       </w:tblBorders>
       <w:tblCellMar>
-        <w:top w:type="dxa" w:w="40"/>
-        <w:left w:type="dxa" w:w="80"/>
-        <w:bottom w:type="dxa" w:w="40"/>
-        <w:right w:type="dxa" w:w="80"/>
+        <w:top w:w="40" w:type="dxa"/>
+        <w:left w:w="80" w:type="dxa"/>
+        <w:bottom w:w="40" w:type="dxa"/>
+        <w:right w:w="80" w:type="dxa"/>
       </w:tblCellMar>
     </w:tblPr>
     <w:tblStylePr w:type="firstRow">
@@ -3072,11 +2946,11 @@
         <w:color w:val="FFFFFF"/>
       </w:rPr>
       <w:tcPr>
-        <w:shd w:color="auto" w:fill="1E60AE" w:val="clear"/>
+        <w:shd w:val="clear" w:color="auto" w:fill="1E60AE"/>
       </w:tcPr>
     </w:tblStylePr>
   </w:style>
-  <w:style w:customStyle="1" w:styleId="DefinitionTerm" w:type="paragraph">
+  <w:style w:type="paragraph" w:customStyle="1" w:styleId="DefinitionTerm">
     <w:name w:val="Definition Term"/>
     <w:basedOn w:val="Normal"/>
     <w:next w:val="Definition"/>
@@ -3089,86 +2963,86 @@
       <w:b/>
     </w:rPr>
   </w:style>
-  <w:style w:customStyle="1" w:styleId="Definition" w:type="paragraph">
+  <w:style w:type="paragraph" w:customStyle="1" w:styleId="Definition">
     <w:name w:val="Definition"/>
     <w:basedOn w:val="Normal"/>
   </w:style>
-  <w:style w:styleId="Caption" w:type="paragraph">
+  <w:style w:type="paragraph" w:styleId="Caption">
     <w:name w:val="Caption"/>
     <w:basedOn w:val="Normal"/>
     <w:link w:val="BodyTextChar"/>
     <w:pPr>
-      <w:spacing w:after="120" w:before="0"/>
+      <w:spacing w:before="0" w:after="120"/>
     </w:pPr>
     <w:rPr>
       <w:i/>
     </w:rPr>
   </w:style>
-  <w:style w:customStyle="1" w:styleId="TableCaption" w:type="paragraph">
+  <w:style w:type="paragraph" w:customStyle="1" w:styleId="TableCaption">
     <w:name w:val="Table Caption"/>
     <w:basedOn w:val="Caption"/>
     <w:pPr>
       <w:keepNext/>
     </w:pPr>
     <w:rPr>
-      <w:rFonts w:ascii="Calibri" w:cs="Calibri" w:eastAsia="Calibri" w:hAnsi="Calibri"/>
+      <w:rFonts w:ascii="Calibri" w:hAnsi="Calibri" w:cs="Calibri" w:eastAsia="Calibri"/>
       <w:color w:val="344054"/>
       <w:sz w:val="21"/>
     </w:rPr>
   </w:style>
-  <w:style w:customStyle="1" w:styleId="ImageCaption" w:type="paragraph">
+  <w:style w:type="paragraph" w:customStyle="1" w:styleId="ImageCaption">
     <w:name w:val="Image Caption"/>
     <w:basedOn w:val="Caption"/>
     <w:rPr>
-      <w:rFonts w:ascii="Calibri" w:cs="Calibri" w:eastAsia="Calibri" w:hAnsi="Calibri"/>
+      <w:rFonts w:ascii="Calibri" w:hAnsi="Calibri" w:cs="Calibri" w:eastAsia="Calibri"/>
       <w:color w:val="344054"/>
       <w:sz w:val="21"/>
     </w:rPr>
   </w:style>
-  <w:style w:customStyle="1" w:styleId="Figure" w:type="paragraph">
+  <w:style w:type="paragraph" w:customStyle="1" w:styleId="Figure">
     <w:name w:val="Figure"/>
     <w:basedOn w:val="Normal"/>
   </w:style>
-  <w:style w:customStyle="1" w:styleId="CaptionedFigure" w:type="paragraph">
+  <w:style w:type="paragraph" w:customStyle="1" w:styleId="CaptionedFigure">
     <w:name w:val="Captioned Figure"/>
     <w:basedOn w:val="Figure"/>
     <w:pPr>
       <w:keepNext/>
     </w:pPr>
   </w:style>
-  <w:style w:customStyle="1" w:styleId="BodyTextChar" w:type="character">
+  <w:style w:type="character" w:customStyle="1" w:styleId="BodyTextChar">
     <w:name w:val="Body Text Char"/>
     <w:basedOn w:val="DefaultParagraphFont"/>
     <w:link w:val="BodyText"/>
   </w:style>
-  <w:style w:customStyle="1" w:styleId="VerbatimChar" w:type="character">
+  <w:style w:type="character" w:customStyle="1" w:styleId="VerbatimChar">
     <w:name w:val="Verbatim Char"/>
     <w:basedOn w:val="BodyTextChar"/>
     <w:rPr>
-      <w:rFonts w:ascii="Consolas" w:cs="Consolas" w:eastAsia="Consolas" w:hAnsi="Consolas"/>
+      <w:rFonts w:ascii="Consolas" w:hAnsi="Consolas" w:cs="Consolas" w:eastAsia="Consolas"/>
       <w:color w:val="0F2A4A"/>
       <w:sz w:val="18"/>
     </w:rPr>
   </w:style>
-  <w:style w:customStyle="1" w:styleId="SectionNumber" w:type="character">
+  <w:style w:type="character" w:customStyle="1" w:styleId="SectionNumber">
     <w:name w:val="Section Number"/>
     <w:basedOn w:val="BodyTextChar"/>
   </w:style>
-  <w:style w:styleId="FootnoteReference" w:type="character">
+  <w:style w:type="character" w:styleId="FootnoteReference">
     <w:name w:val="Footnote Reference"/>
     <w:basedOn w:val="BodyTextChar"/>
     <w:rPr>
       <w:vertAlign w:val="superscript"/>
     </w:rPr>
   </w:style>
-  <w:style w:styleId="Hyperlink" w:type="character">
+  <w:style w:type="character" w:styleId="Hyperlink">
     <w:name w:val="Hyperlink"/>
     <w:basedOn w:val="BodyTextChar"/>
     <w:rPr>
-      <w:color w:themeColor="accent1" w:val="4F81BD"/>
-    </w:rPr>
-  </w:style>
-  <w:style w:styleId="TOCHeading" w:type="paragraph">
+      <w:color w:val="4F81BD" w:themeColor="accent1"/>
+    </w:rPr>
+  </w:style>
+  <w:style w:type="paragraph" w:styleId="TOCHeading">
     <w:name w:val="TOC Heading"/>
     <w:basedOn w:val="Heading1"/>
     <w:next w:val="BodyText"/>
@@ -3180,7 +3054,7 @@
       <w:outlineLvl w:val="9"/>
     </w:pPr>
     <w:rPr>
-      <w:rFonts w:ascii="Calibri" w:cs="Calibri" w:eastAsia="Calibri" w:hAnsi="Calibri"/>
+      <w:rFonts w:ascii="Calibri" w:hAnsi="Calibri" w:cs="Calibri" w:eastAsia="Calibri"/>
       <w:b/>
       <w:bCs w:val="0"/>
       <w:color w:val="1E60AE"/>
@@ -3276,10 +3150,7 @@
   <w:style w:type="character" w:customStyle="1" w:styleId="ImportTok">
     <w:name w:val="ImportTok"/>
     <w:basedOn w:val="VerbatimChar"/>
-    <w:rPr>
-      <w:color w:val="008000"/>
-      <w:b/>
-    </w:rPr>
+    <w:rPr/>
   </w:style>
   <w:style w:type="character" w:customStyle="1" w:styleId="CommentTok">
     <w:name w:val="CommentTok"/>
@@ -3354,9 +3225,7 @@
   <w:style w:type="character" w:customStyle="1" w:styleId="BuiltInTok">
     <w:name w:val="BuiltInTok"/>
     <w:basedOn w:val="VerbatimChar"/>
-    <w:rPr>
-      <w:color w:val="008000"/>
-    </w:rPr>
+    <w:rPr/>
   </w:style>
   <w:style w:type="character" w:customStyle="1" w:styleId="ExtensionTok">
     <w:name w:val="ExtensionTok"/>

</xml_diff>

<commit_message>
User manual in Word and PowerPoint (docs/Usermanual)
- docs/Usermanual.docx (source docs/Usermanual.md): how GIAW works and how each user works in it, from the audit
  cycle to auditees and administrators, with current screens, FAQ, quick reference cards and glossary.
- docs/Usermanual.pptx: the companion slide deck (27 slides).
- New screenshots: audit universe, assurance map, entity assurance tab, My work, Professional practice.
- Replaces docs/manuals/05-User-Manual; references updated in the index, technical and governance documents.

Co-Authored-By: Claude Opus 5.5 <noreply@anthropic.com>
Claude-Session: https://claude.ai/code/session_01BCzcS7kB9PYn4XhtsXF9GJ
</commit_message>
<xml_diff>
--- a/docs/manuals/00-Documentation-Index.docx
+++ b/docs/manuals/00-Documentation-Index.docx
@@ -845,7 +845,7 @@
               <w:jc w:val="left"/>
             </w:pPr>
             <w:r>
-              <w:t xml:space="preserve">Screen-by-screen guide with 55 screenshots: getting started, lists and forms, audit management, resources, risk, compliance, analytics and reporting, auditees, FAQ, quick reference cards</w:t>
+              <w:t xml:space="preserve">How GIAW works and how each user works in it: the audit cycle, getting started, universe and assurance map, plan, audits, reports, follow-up, Committee, quality, auditees, administrators, FAQ, quick reference cards, glossary; with a companion slide deck</w:t>
             </w:r>
           </w:p>
         </w:tc>
@@ -870,7 +870,7 @@
               <w:rPr>
                 <w:rStyle w:val="VerbatimChar"/>
               </w:rPr>
-              <w:t xml:space="preserve">05-User-Manual.md</w:t>
+              <w:t xml:space="preserve">docs/Usermanual.md</w:t>
             </w:r>
             <w:r>
               <w:t xml:space="preserve"> </w:t>
@@ -886,6 +886,21 @@
                 <w:rStyle w:val="VerbatimChar"/>
               </w:rPr>
               <w:t xml:space="preserve">.docx</w:t>
+            </w:r>
+            <w:r>
+              <w:t xml:space="preserve"> </w:t>
+            </w:r>
+            <w:r>
+              <w:t xml:space="preserve">/</w:t>
+            </w:r>
+            <w:r>
+              <w:t xml:space="preserve"> </w:t>
+            </w:r>
+            <w:r>
+              <w:rPr>
+                <w:rStyle w:val="VerbatimChar"/>
+              </w:rPr>
+              <w:t xml:space="preserve">.pptx</w:t>
             </w:r>
           </w:p>
         </w:tc>
@@ -2093,7 +2108,7 @@
               <w:jc w:val="left"/>
             </w:pPr>
             <w:r>
-              <w:t xml:space="preserve">User Manual §11</w:t>
+              <w:t xml:space="preserve">User Manual §16</w:t>
             </w:r>
           </w:p>
         </w:tc>
@@ -2234,7 +2249,25 @@
         <w:rPr>
           <w:rStyle w:val="VerbatimChar"/>
         </w:rPr>
-        <w:t xml:space="preserve">pandoc 05-User-Manual.md -o 05-User-Manual.docx --reference-doc=reference.docx --toc --resource-path=.</w:t>
+        <w:t xml:space="preserve">pandoc 06-Training-Guide.md -o 06-Training-Guide.docx --reference-doc=reference.docx --toc --resource-path=.</w:t>
+      </w:r>
+      <w:r>
+        <w:br/>
+      </w:r>
+      <w:r>
+        <w:rPr>
+          <w:rStyle w:val="VerbatimChar"/>
+        </w:rPr>
+        <w:t xml:space="preserve"># User Manual (from the docs folder)</w:t>
+      </w:r>
+      <w:r>
+        <w:br/>
+      </w:r>
+      <w:r>
+        <w:rPr>
+          <w:rStyle w:val="VerbatimChar"/>
+        </w:rPr>
+        <w:t xml:space="preserve">cd .. &amp;&amp; pandoc Usermanual.md -o Usermanual.docx --reference-doc=manuals/reference.docx --toc --resource-path=.</w:t>
       </w:r>
     </w:p>
     <w:p>

</xml_diff>